<commit_message>
Update final Jar Growth assignment report
</commit_message>
<xml_diff>
--- a/Report/Jar_Growth_Intern_Assignment_Report.docx
+++ b/Report/Jar_Growth_Intern_Assignment_Report.docx
@@ -209,7 +209,19 @@
         <w:rPr>
           <w:rFonts w:ascii="Calibri" w:hAnsi="Calibri"/>
         </w:rPr>
-        <w:t>20 July 2026</w:t>
+        <w:t>2</w:t>
+      </w:r>
+      <w:r>
+        <w:rPr>
+          <w:rFonts w:ascii="Calibri" w:hAnsi="Calibri"/>
+        </w:rPr>
+        <w:t>2</w:t>
+      </w:r>
+      <w:r>
+        <w:rPr>
+          <w:rFonts w:ascii="Calibri" w:hAnsi="Calibri"/>
+        </w:rPr>
+        <w:t xml:space="preserve"> July 2026</w:t>
       </w:r>
     </w:p>
     <w:p>

</xml_diff>